<commit_message>
Updated report + readme
</commit_message>
<xml_diff>
--- a/Report.docx
+++ b/Report.docx
@@ -375,25 +375,22 @@
     </w:p>
     <w:sdt>
       <w:sdtPr>
+        <w:id w:val="1360704458"/>
+        <w:docPartObj>
+          <w:docPartGallery w:val="Table of Contents"/>
+          <w:docPartUnique/>
+        </w:docPartObj>
+      </w:sdtPr>
+      <w:sdtEndPr>
         <w:rPr>
           <w:rFonts w:asciiTheme="minorHAnsi" w:eastAsiaTheme="minorHAnsi" w:hAnsiTheme="minorHAnsi" w:cstheme="minorBidi"/>
-          <w:b w:val="0"/>
+          <w:noProof/>
           <w:color w:val="auto"/>
           <w:kern w:val="2"/>
           <w:sz w:val="24"/>
           <w:szCs w:val="24"/>
           <w:lang w:val="en-AU"/>
           <w14:ligatures w14:val="standardContextual"/>
-        </w:rPr>
-        <w:id w:val="-1640561395"/>
-        <w:docPartObj>
-          <w:docPartGallery w:val="Table of Contents"/>
-          <w:docPartUnique/>
-        </w:docPartObj>
-      </w:sdtPr>
-      <w:sdtEndPr>
-        <w:rPr>
-          <w:bCs w:val="0"/>
         </w:rPr>
       </w:sdtEndPr>
       <w:sdtContent>
@@ -412,6 +409,13 @@
         </w:p>
         <w:p>
           <w:pPr>
+            <w:rPr>
+              <w:lang w:val="en-US"/>
+            </w:rPr>
+          </w:pPr>
+        </w:p>
+        <w:p>
+          <w:pPr>
             <w:pStyle w:val="TOC1"/>
             <w:tabs>
               <w:tab w:val="left" w:pos="480"/>
@@ -421,34 +425,30 @@
               <w:rFonts w:eastAsiaTheme="minorEastAsia"/>
               <w:b w:val="0"/>
               <w:bCs w:val="0"/>
+              <w:i w:val="0"/>
+              <w:iCs w:val="0"/>
               <w:noProof/>
-              <w:sz w:val="24"/>
-              <w:szCs w:val="24"/>
               <w:lang w:eastAsia="en-GB"/>
             </w:rPr>
           </w:pPr>
           <w:r>
             <w:rPr>
-              <w:sz w:val="22"/>
-              <w:szCs w:val="22"/>
+              <w:b w:val="0"/>
+              <w:bCs w:val="0"/>
             </w:rPr>
             <w:fldChar w:fldCharType="begin"/>
           </w:r>
           <w:r>
-            <w:rPr>
-              <w:sz w:val="22"/>
-              <w:szCs w:val="22"/>
-            </w:rPr>
             <w:instrText xml:space="preserve"> TOC \o "1-3" \h \z \u </w:instrText>
           </w:r>
           <w:r>
             <w:rPr>
-              <w:sz w:val="22"/>
-              <w:szCs w:val="22"/>
+              <w:b w:val="0"/>
+              <w:bCs w:val="0"/>
             </w:rPr>
             <w:fldChar w:fldCharType="separate"/>
           </w:r>
-          <w:hyperlink w:anchor="_Toc182126652" w:history="1">
+          <w:hyperlink w:anchor="_Toc182129268" w:history="1">
             <w:r>
               <w:rPr>
                 <w:rStyle w:val="Hyperlink"/>
@@ -461,9 +461,9 @@
                 <w:rFonts w:eastAsiaTheme="minorEastAsia"/>
                 <w:b w:val="0"/>
                 <w:bCs w:val="0"/>
-                <w:noProof/>
-                <w:sz w:val="24"/>
-                <w:szCs w:val="24"/>
+                <w:i w:val="0"/>
+                <w:iCs w:val="0"/>
+                <w:noProof/>
                 <w:lang w:eastAsia="en-GB"/>
               </w:rPr>
               <w:tab/>
@@ -494,7 +494,7 @@
                 <w:noProof/>
                 <w:webHidden/>
               </w:rPr>
-              <w:instrText xml:space="preserve"> PAGEREF _Toc182126652 \h </w:instrText>
+              <w:instrText xml:space="preserve"> PAGEREF _Toc182129268 \h </w:instrText>
             </w:r>
             <w:r>
               <w:rPr>
@@ -536,13 +536,13 @@
               <w:rFonts w:eastAsiaTheme="minorEastAsia"/>
               <w:b w:val="0"/>
               <w:bCs w:val="0"/>
+              <w:i w:val="0"/>
+              <w:iCs w:val="0"/>
               <w:noProof/>
-              <w:sz w:val="24"/>
-              <w:szCs w:val="24"/>
               <w:lang w:eastAsia="en-GB"/>
             </w:rPr>
           </w:pPr>
-          <w:hyperlink w:anchor="_Toc182126653" w:history="1">
+          <w:hyperlink w:anchor="_Toc182129269" w:history="1">
             <w:r>
               <w:rPr>
                 <w:rStyle w:val="Hyperlink"/>
@@ -555,9 +555,9 @@
                 <w:rFonts w:eastAsiaTheme="minorEastAsia"/>
                 <w:b w:val="0"/>
                 <w:bCs w:val="0"/>
-                <w:noProof/>
-                <w:sz w:val="24"/>
-                <w:szCs w:val="24"/>
+                <w:i w:val="0"/>
+                <w:iCs w:val="0"/>
+                <w:noProof/>
                 <w:lang w:eastAsia="en-GB"/>
               </w:rPr>
               <w:tab/>
@@ -588,7 +588,7 @@
                 <w:noProof/>
                 <w:webHidden/>
               </w:rPr>
-              <w:instrText xml:space="preserve"> PAGEREF _Toc182126653 \h </w:instrText>
+              <w:instrText xml:space="preserve"> PAGEREF _Toc182129269 \h </w:instrText>
             </w:r>
             <w:r>
               <w:rPr>
@@ -628,15 +628,15 @@
             </w:tabs>
             <w:rPr>
               <w:rFonts w:eastAsiaTheme="minorEastAsia"/>
-              <w:i w:val="0"/>
-              <w:iCs w:val="0"/>
+              <w:b w:val="0"/>
+              <w:bCs w:val="0"/>
               <w:noProof/>
               <w:sz w:val="24"/>
               <w:szCs w:val="24"/>
               <w:lang w:eastAsia="en-GB"/>
             </w:rPr>
           </w:pPr>
-          <w:hyperlink w:anchor="_Toc182126654" w:history="1">
+          <w:hyperlink w:anchor="_Toc182129270" w:history="1">
             <w:r>
               <w:rPr>
                 <w:rStyle w:val="Hyperlink"/>
@@ -647,8 +647,8 @@
             <w:r>
               <w:rPr>
                 <w:rFonts w:eastAsiaTheme="minorEastAsia"/>
-                <w:i w:val="0"/>
-                <w:iCs w:val="0"/>
+                <w:b w:val="0"/>
+                <w:bCs w:val="0"/>
                 <w:noProof/>
                 <w:sz w:val="24"/>
                 <w:szCs w:val="24"/>
@@ -682,7 +682,7 @@
                 <w:noProof/>
                 <w:webHidden/>
               </w:rPr>
-              <w:instrText xml:space="preserve"> PAGEREF _Toc182126654 \h </w:instrText>
+              <w:instrText xml:space="preserve"> PAGEREF _Toc182129270 \h </w:instrText>
             </w:r>
             <w:r>
               <w:rPr>
@@ -722,15 +722,15 @@
             </w:tabs>
             <w:rPr>
               <w:rFonts w:eastAsiaTheme="minorEastAsia"/>
-              <w:i w:val="0"/>
-              <w:iCs w:val="0"/>
+              <w:b w:val="0"/>
+              <w:bCs w:val="0"/>
               <w:noProof/>
               <w:sz w:val="24"/>
               <w:szCs w:val="24"/>
               <w:lang w:eastAsia="en-GB"/>
             </w:rPr>
           </w:pPr>
-          <w:hyperlink w:anchor="_Toc182126655" w:history="1">
+          <w:hyperlink w:anchor="_Toc182129271" w:history="1">
             <w:r>
               <w:rPr>
                 <w:rStyle w:val="Hyperlink"/>
@@ -741,8 +741,8 @@
             <w:r>
               <w:rPr>
                 <w:rFonts w:eastAsiaTheme="minorEastAsia"/>
-                <w:i w:val="0"/>
-                <w:iCs w:val="0"/>
+                <w:b w:val="0"/>
+                <w:bCs w:val="0"/>
                 <w:noProof/>
                 <w:sz w:val="24"/>
                 <w:szCs w:val="24"/>
@@ -776,7 +776,7 @@
                 <w:noProof/>
                 <w:webHidden/>
               </w:rPr>
-              <w:instrText xml:space="preserve"> PAGEREF _Toc182126655 \h </w:instrText>
+              <w:instrText xml:space="preserve"> PAGEREF _Toc182129271 \h </w:instrText>
             </w:r>
             <w:r>
               <w:rPr>
@@ -822,7 +822,7 @@
               <w:lang w:eastAsia="en-GB"/>
             </w:rPr>
           </w:pPr>
-          <w:hyperlink w:anchor="_Toc182126656" w:history="1">
+          <w:hyperlink w:anchor="_Toc182129272" w:history="1">
             <w:r>
               <w:rPr>
                 <w:rStyle w:val="Hyperlink"/>
@@ -866,7 +866,7 @@
                 <w:noProof/>
                 <w:webHidden/>
               </w:rPr>
-              <w:instrText xml:space="preserve"> PAGEREF _Toc182126656 \h </w:instrText>
+              <w:instrText xml:space="preserve"> PAGEREF _Toc182129272 \h </w:instrText>
             </w:r>
             <w:r>
               <w:rPr>
@@ -912,7 +912,7 @@
               <w:lang w:eastAsia="en-GB"/>
             </w:rPr>
           </w:pPr>
-          <w:hyperlink w:anchor="_Toc182126657" w:history="1">
+          <w:hyperlink w:anchor="_Toc182129273" w:history="1">
             <w:r>
               <w:rPr>
                 <w:rStyle w:val="Hyperlink"/>
@@ -956,7 +956,7 @@
                 <w:noProof/>
                 <w:webHidden/>
               </w:rPr>
-              <w:instrText xml:space="preserve"> PAGEREF _Toc182126657 \h </w:instrText>
+              <w:instrText xml:space="preserve"> PAGEREF _Toc182129273 \h </w:instrText>
             </w:r>
             <w:r>
               <w:rPr>
@@ -1002,7 +1002,7 @@
               <w:lang w:eastAsia="en-GB"/>
             </w:rPr>
           </w:pPr>
-          <w:hyperlink w:anchor="_Toc182126658" w:history="1">
+          <w:hyperlink w:anchor="_Toc182129274" w:history="1">
             <w:r>
               <w:rPr>
                 <w:rStyle w:val="Hyperlink"/>
@@ -1046,7 +1046,7 @@
                 <w:noProof/>
                 <w:webHidden/>
               </w:rPr>
-              <w:instrText xml:space="preserve"> PAGEREF _Toc182126658 \h </w:instrText>
+              <w:instrText xml:space="preserve"> PAGEREF _Toc182129274 \h </w:instrText>
             </w:r>
             <w:r>
               <w:rPr>
@@ -1092,7 +1092,7 @@
               <w:lang w:eastAsia="en-GB"/>
             </w:rPr>
           </w:pPr>
-          <w:hyperlink w:anchor="_Toc182126659" w:history="1">
+          <w:hyperlink w:anchor="_Toc182129275" w:history="1">
             <w:r>
               <w:rPr>
                 <w:rStyle w:val="Hyperlink"/>
@@ -1136,7 +1136,7 @@
                 <w:noProof/>
                 <w:webHidden/>
               </w:rPr>
-              <w:instrText xml:space="preserve"> PAGEREF _Toc182126659 \h </w:instrText>
+              <w:instrText xml:space="preserve"> PAGEREF _Toc182129275 \h </w:instrText>
             </w:r>
             <w:r>
               <w:rPr>
@@ -1178,13 +1178,13 @@
               <w:rFonts w:eastAsiaTheme="minorEastAsia"/>
               <w:b w:val="0"/>
               <w:bCs w:val="0"/>
+              <w:i w:val="0"/>
+              <w:iCs w:val="0"/>
               <w:noProof/>
-              <w:sz w:val="24"/>
-              <w:szCs w:val="24"/>
               <w:lang w:eastAsia="en-GB"/>
             </w:rPr>
           </w:pPr>
-          <w:hyperlink w:anchor="_Toc182126660" w:history="1">
+          <w:hyperlink w:anchor="_Toc182129276" w:history="1">
             <w:r>
               <w:rPr>
                 <w:rStyle w:val="Hyperlink"/>
@@ -1197,9 +1197,9 @@
                 <w:rFonts w:eastAsiaTheme="minorEastAsia"/>
                 <w:b w:val="0"/>
                 <w:bCs w:val="0"/>
-                <w:noProof/>
-                <w:sz w:val="24"/>
-                <w:szCs w:val="24"/>
+                <w:i w:val="0"/>
+                <w:iCs w:val="0"/>
+                <w:noProof/>
                 <w:lang w:eastAsia="en-GB"/>
               </w:rPr>
               <w:tab/>
@@ -1230,7 +1230,7 @@
                 <w:noProof/>
                 <w:webHidden/>
               </w:rPr>
-              <w:instrText xml:space="preserve"> PAGEREF _Toc182126660 \h </w:instrText>
+              <w:instrText xml:space="preserve"> PAGEREF _Toc182129276 \h </w:instrText>
             </w:r>
             <w:r>
               <w:rPr>
@@ -1272,13 +1272,13 @@
               <w:rFonts w:eastAsiaTheme="minorEastAsia"/>
               <w:b w:val="0"/>
               <w:bCs w:val="0"/>
+              <w:i w:val="0"/>
+              <w:iCs w:val="0"/>
               <w:noProof/>
-              <w:sz w:val="24"/>
-              <w:szCs w:val="24"/>
               <w:lang w:eastAsia="en-GB"/>
             </w:rPr>
           </w:pPr>
-          <w:hyperlink w:anchor="_Toc182126661" w:history="1">
+          <w:hyperlink w:anchor="_Toc182129277" w:history="1">
             <w:r>
               <w:rPr>
                 <w:rStyle w:val="Hyperlink"/>
@@ -1291,9 +1291,9 @@
                 <w:rFonts w:eastAsiaTheme="minorEastAsia"/>
                 <w:b w:val="0"/>
                 <w:bCs w:val="0"/>
-                <w:noProof/>
-                <w:sz w:val="24"/>
-                <w:szCs w:val="24"/>
+                <w:i w:val="0"/>
+                <w:iCs w:val="0"/>
+                <w:noProof/>
                 <w:lang w:eastAsia="en-GB"/>
               </w:rPr>
               <w:tab/>
@@ -1324,7 +1324,7 @@
                 <w:noProof/>
                 <w:webHidden/>
               </w:rPr>
-              <w:instrText xml:space="preserve"> PAGEREF _Toc182126661 \h </w:instrText>
+              <w:instrText xml:space="preserve"> PAGEREF _Toc182129277 \h </w:instrText>
             </w:r>
             <w:r>
               <w:rPr>
@@ -1364,15 +1364,15 @@
             </w:tabs>
             <w:rPr>
               <w:rFonts w:eastAsiaTheme="minorEastAsia"/>
-              <w:i w:val="0"/>
-              <w:iCs w:val="0"/>
+              <w:b w:val="0"/>
+              <w:bCs w:val="0"/>
               <w:noProof/>
               <w:sz w:val="24"/>
               <w:szCs w:val="24"/>
               <w:lang w:eastAsia="en-GB"/>
             </w:rPr>
           </w:pPr>
-          <w:hyperlink w:anchor="_Toc182126662" w:history="1">
+          <w:hyperlink w:anchor="_Toc182129278" w:history="1">
             <w:r>
               <w:rPr>
                 <w:rStyle w:val="Hyperlink"/>
@@ -1383,8 +1383,8 @@
             <w:r>
               <w:rPr>
                 <w:rFonts w:eastAsiaTheme="minorEastAsia"/>
-                <w:i w:val="0"/>
-                <w:iCs w:val="0"/>
+                <w:b w:val="0"/>
+                <w:bCs w:val="0"/>
                 <w:noProof/>
                 <w:sz w:val="24"/>
                 <w:szCs w:val="24"/>
@@ -1418,7 +1418,7 @@
                 <w:noProof/>
                 <w:webHidden/>
               </w:rPr>
-              <w:instrText xml:space="preserve"> PAGEREF _Toc182126662 \h </w:instrText>
+              <w:instrText xml:space="preserve"> PAGEREF _Toc182129278 \h </w:instrText>
             </w:r>
             <w:r>
               <w:rPr>
@@ -1458,15 +1458,15 @@
             </w:tabs>
             <w:rPr>
               <w:rFonts w:eastAsiaTheme="minorEastAsia"/>
-              <w:i w:val="0"/>
-              <w:iCs w:val="0"/>
+              <w:b w:val="0"/>
+              <w:bCs w:val="0"/>
               <w:noProof/>
               <w:sz w:val="24"/>
               <w:szCs w:val="24"/>
               <w:lang w:eastAsia="en-GB"/>
             </w:rPr>
           </w:pPr>
-          <w:hyperlink w:anchor="_Toc182126663" w:history="1">
+          <w:hyperlink w:anchor="_Toc182129279" w:history="1">
             <w:r>
               <w:rPr>
                 <w:rStyle w:val="Hyperlink"/>
@@ -1477,8 +1477,8 @@
             <w:r>
               <w:rPr>
                 <w:rFonts w:eastAsiaTheme="minorEastAsia"/>
-                <w:i w:val="0"/>
-                <w:iCs w:val="0"/>
+                <w:b w:val="0"/>
+                <w:bCs w:val="0"/>
                 <w:noProof/>
                 <w:sz w:val="24"/>
                 <w:szCs w:val="24"/>
@@ -1512,7 +1512,7 @@
                 <w:noProof/>
                 <w:webHidden/>
               </w:rPr>
-              <w:instrText xml:space="preserve"> PAGEREF _Toc182126663 \h </w:instrText>
+              <w:instrText xml:space="preserve"> PAGEREF _Toc182129279 \h </w:instrText>
             </w:r>
             <w:r>
               <w:rPr>
@@ -1554,13 +1554,13 @@
               <w:rFonts w:eastAsiaTheme="minorEastAsia"/>
               <w:b w:val="0"/>
               <w:bCs w:val="0"/>
+              <w:i w:val="0"/>
+              <w:iCs w:val="0"/>
               <w:noProof/>
-              <w:sz w:val="24"/>
-              <w:szCs w:val="24"/>
               <w:lang w:eastAsia="en-GB"/>
             </w:rPr>
           </w:pPr>
-          <w:hyperlink w:anchor="_Toc182126664" w:history="1">
+          <w:hyperlink w:anchor="_Toc182129280" w:history="1">
             <w:r>
               <w:rPr>
                 <w:rStyle w:val="Hyperlink"/>
@@ -1573,9 +1573,9 @@
                 <w:rFonts w:eastAsiaTheme="minorEastAsia"/>
                 <w:b w:val="0"/>
                 <w:bCs w:val="0"/>
-                <w:noProof/>
-                <w:sz w:val="24"/>
-                <w:szCs w:val="24"/>
+                <w:i w:val="0"/>
+                <w:iCs w:val="0"/>
+                <w:noProof/>
                 <w:lang w:eastAsia="en-GB"/>
               </w:rPr>
               <w:tab/>
@@ -1606,7 +1606,7 @@
                 <w:noProof/>
                 <w:webHidden/>
               </w:rPr>
-              <w:instrText xml:space="preserve"> PAGEREF _Toc182126664 \h </w:instrText>
+              <w:instrText xml:space="preserve"> PAGEREF _Toc182129280 \h </w:instrText>
             </w:r>
             <w:r>
               <w:rPr>
@@ -1648,13 +1648,13 @@
               <w:rFonts w:eastAsiaTheme="minorEastAsia"/>
               <w:b w:val="0"/>
               <w:bCs w:val="0"/>
+              <w:i w:val="0"/>
+              <w:iCs w:val="0"/>
               <w:noProof/>
-              <w:sz w:val="24"/>
-              <w:szCs w:val="24"/>
               <w:lang w:eastAsia="en-GB"/>
             </w:rPr>
           </w:pPr>
-          <w:hyperlink w:anchor="_Toc182126665" w:history="1">
+          <w:hyperlink w:anchor="_Toc182129281" w:history="1">
             <w:r>
               <w:rPr>
                 <w:rStyle w:val="Hyperlink"/>
@@ -1667,9 +1667,9 @@
                 <w:rFonts w:eastAsiaTheme="minorEastAsia"/>
                 <w:b w:val="0"/>
                 <w:bCs w:val="0"/>
-                <w:noProof/>
-                <w:sz w:val="24"/>
-                <w:szCs w:val="24"/>
+                <w:i w:val="0"/>
+                <w:iCs w:val="0"/>
+                <w:noProof/>
                 <w:lang w:eastAsia="en-GB"/>
               </w:rPr>
               <w:tab/>
@@ -1700,7 +1700,7 @@
                 <w:noProof/>
                 <w:webHidden/>
               </w:rPr>
-              <w:instrText xml:space="preserve"> PAGEREF _Toc182126665 \h </w:instrText>
+              <w:instrText xml:space="preserve"> PAGEREF _Toc182129281 \h </w:instrText>
             </w:r>
             <w:r>
               <w:rPr>
@@ -1742,13 +1742,13 @@
               <w:rFonts w:eastAsiaTheme="minorEastAsia"/>
               <w:b w:val="0"/>
               <w:bCs w:val="0"/>
+              <w:i w:val="0"/>
+              <w:iCs w:val="0"/>
               <w:noProof/>
-              <w:sz w:val="24"/>
-              <w:szCs w:val="24"/>
               <w:lang w:eastAsia="en-GB"/>
             </w:rPr>
           </w:pPr>
-          <w:hyperlink w:anchor="_Toc182126666" w:history="1">
+          <w:hyperlink w:anchor="_Toc182129282" w:history="1">
             <w:r>
               <w:rPr>
                 <w:rStyle w:val="Hyperlink"/>
@@ -1761,9 +1761,9 @@
                 <w:rFonts w:eastAsiaTheme="minorEastAsia"/>
                 <w:b w:val="0"/>
                 <w:bCs w:val="0"/>
-                <w:noProof/>
-                <w:sz w:val="24"/>
-                <w:szCs w:val="24"/>
+                <w:i w:val="0"/>
+                <w:iCs w:val="0"/>
+                <w:noProof/>
                 <w:lang w:eastAsia="en-GB"/>
               </w:rPr>
               <w:tab/>
@@ -1794,7 +1794,7 @@
                 <w:noProof/>
                 <w:webHidden/>
               </w:rPr>
-              <w:instrText xml:space="preserve"> PAGEREF _Toc182126666 \h </w:instrText>
+              <w:instrText xml:space="preserve"> PAGEREF _Toc182129282 \h </w:instrText>
             </w:r>
             <w:r>
               <w:rPr>
@@ -1836,13 +1836,13 @@
               <w:rFonts w:eastAsiaTheme="minorEastAsia"/>
               <w:b w:val="0"/>
               <w:bCs w:val="0"/>
+              <w:i w:val="0"/>
+              <w:iCs w:val="0"/>
               <w:noProof/>
-              <w:sz w:val="24"/>
-              <w:szCs w:val="24"/>
               <w:lang w:eastAsia="en-GB"/>
             </w:rPr>
           </w:pPr>
-          <w:hyperlink w:anchor="_Toc182126667" w:history="1">
+          <w:hyperlink w:anchor="_Toc182129283" w:history="1">
             <w:r>
               <w:rPr>
                 <w:rStyle w:val="Hyperlink"/>
@@ -1855,9 +1855,9 @@
                 <w:rFonts w:eastAsiaTheme="minorEastAsia"/>
                 <w:b w:val="0"/>
                 <w:bCs w:val="0"/>
-                <w:noProof/>
-                <w:sz w:val="24"/>
-                <w:szCs w:val="24"/>
+                <w:i w:val="0"/>
+                <w:iCs w:val="0"/>
+                <w:noProof/>
                 <w:lang w:eastAsia="en-GB"/>
               </w:rPr>
               <w:tab/>
@@ -1888,7 +1888,7 @@
                 <w:noProof/>
                 <w:webHidden/>
               </w:rPr>
-              <w:instrText xml:space="preserve"> PAGEREF _Toc182126667 \h </w:instrText>
+              <w:instrText xml:space="preserve"> PAGEREF _Toc182129283 \h </w:instrText>
             </w:r>
             <w:r>
               <w:rPr>
@@ -1930,13 +1930,13 @@
               <w:rFonts w:eastAsiaTheme="minorEastAsia"/>
               <w:b w:val="0"/>
               <w:bCs w:val="0"/>
+              <w:i w:val="0"/>
+              <w:iCs w:val="0"/>
               <w:noProof/>
-              <w:sz w:val="24"/>
-              <w:szCs w:val="24"/>
               <w:lang w:eastAsia="en-GB"/>
             </w:rPr>
           </w:pPr>
-          <w:hyperlink w:anchor="_Toc182126668" w:history="1">
+          <w:hyperlink w:anchor="_Toc182129284" w:history="1">
             <w:r>
               <w:rPr>
                 <w:rStyle w:val="Hyperlink"/>
@@ -1949,9 +1949,9 @@
                 <w:rFonts w:eastAsiaTheme="minorEastAsia"/>
                 <w:b w:val="0"/>
                 <w:bCs w:val="0"/>
-                <w:noProof/>
-                <w:sz w:val="24"/>
-                <w:szCs w:val="24"/>
+                <w:i w:val="0"/>
+                <w:iCs w:val="0"/>
+                <w:noProof/>
                 <w:lang w:eastAsia="en-GB"/>
               </w:rPr>
               <w:tab/>
@@ -1982,7 +1982,7 @@
                 <w:noProof/>
                 <w:webHidden/>
               </w:rPr>
-              <w:instrText xml:space="preserve"> PAGEREF _Toc182126668 \h </w:instrText>
+              <w:instrText xml:space="preserve"> PAGEREF _Toc182129284 \h </w:instrText>
             </w:r>
             <w:r>
               <w:rPr>
@@ -2019,8 +2019,6 @@
               <w:b/>
               <w:bCs/>
               <w:noProof/>
-              <w:sz w:val="28"/>
-              <w:szCs w:val="28"/>
             </w:rPr>
             <w:fldChar w:fldCharType="end"/>
           </w:r>
@@ -2038,7 +2036,7 @@
       <w:pPr>
         <w:pStyle w:val="Heading1"/>
       </w:pPr>
-      <w:bookmarkStart w:id="4" w:name="_Toc182126652"/>
+      <w:bookmarkStart w:id="4" w:name="_Toc182129268"/>
       <w:r>
         <w:lastRenderedPageBreak/>
         <w:t>The Problem</w:t>
@@ -2102,7 +2100,7 @@
         <w:fldChar w:fldCharType="begin"/>
       </w:r>
       <w:r>
-        <w:instrText xml:space="preserve"> ADDIN ZOTERO_ITEM CSL_CITATION {"citationID":"yhpP8bT4","properties":{"formattedCitation":"(Gupta, 2023; Wikipedia contributors, 2024a)","plainCitation":"(Gupta, 2023; Wikipedia contributors, 2024a)","noteIndex":0},"citationItems":[{"id":516,"uris":["http://zotero.org/users/14909358/items/RAJTZ6G3"],"itemData":{"id":516,"type":"webpage","abstract":"A Computer Science portal for geeks. It contains well written, well thought and well explained computer science and programming articles, quizzes and practice/competitive programming/company interview Questions.","container-title":"GeeksforGeeks","language":"en-US","note":"section: DSA","title":"Bin Packing Problem (Minimize number of used Bins)","URL":"https://www.geeksforgeeks.org/bin-packing-problem-minimize-number-of-used-bins/","author":[{"family":"Gupta","given":"Dheeraj"}],"accessed":{"date-parts":[["2024",11,2]]},"issued":{"date-parts":[["2023",4,5]]}}},{"id":520,"uris":["http://zotero.org/users/14909358/items/FF9JKN9M"],"itemData":{"id":520,"type":"entry-encyclopedia","abstract":"The bin packing problem is an optimization problem, in which items of different sizes must be packed into a finite number of bins or containers, each of a fixed given capacity, in a way that minimizes the number of bins used. The problem has many applications, such as filling up containers, loading trucks with weight capacity constraints, creating file backups in media, splitting a network prefix into multiple subnets, and technology mapping in FPGA semiconductor chip design.\nComputationally, the problem is NP-hard, and the corresponding decision problem, deciding if items can fit into a specified number of bins, is NP-complete. Despite its worst-case hardness, optimal solutions to very large instances of the problem can be produced with sophisticated algorithms. In addition, many approximation algorithms exist. For example, the first fit algorithm provides a fast but often non-optimal solution, involving placing each item into the first bin in which it will fit. It requires Θ(n log n) time, where n is the number of items to be packed. The algorithm can be made much more effective by first sorting the list of items into decreasing order (sometimes known as the first-fit decreasing algorithm), although this still does not guarantee an optimal solution and for longer lists may increase the running time of the algorithm. It is known, however, that there always exists at least one ordering of items that allows first-fit to produce an optimal solution.\nThere are many variations of this problem, such as 2D packing, linear packing, packing by weight, packing by cost, and so on. The bin packing problem can also be seen as a special case of the cutting stock problem. When the number of bins is restricted to 1 and each item is characterized by both a volume and a value, the problem of maximizing the value of items that can fit in the bin is known as the knapsack problem.\nA variant of bin packing that occurs in practice is when items can share space when packed into a bin. Specifically,  a set of items could occupy less space when packed together than the sum of their individual sizes. This variant is known as VM packing since when virtual machines (VMs) are packed in a server, their total memory requirement could decrease due to pages shared by the VMs that need only be stored once. If items can share space in arbitrary ways, the bin packing problem is hard to even approximate. However, if space sharing fits into a hierarchy, as is the case with memory sharing in virtual machines, the bin packing problem can be efficiently approximated.\nAnother variant of bin packing of interest in practice is the so-called online bin packing. Here the items of different volume are supposed to arrive sequentially, and the decision maker has to decide whether to select and pack the currently observed item, or else to let it pass. Each decision is without recall. In contrast, offline bin packing allows rearranging the items in the hope of achieving a better packing once additional items arrive. This of course requires additional storage for holding the items to be rearranged.","container-title":"Wikipedia","language":"en","license":"Creative Commons Attribution-ShareAlike License","note":"Page Version ID: 1237237290","source":"Wikipedia","title":"Bin packing problem","URL":"https://en.wikipedia.org/w/index.php?title=Bin_packing_problem&amp;oldid=1237237290","author":[{"literal":"Wikipedia contributors"}],"accessed":{"date-parts":[["2024",11,2]]},"issued":{"date-parts":[["2024",7,28]]}}}],"schema":"https://github.com/citation-style-language/schema/raw/master/csl-citation.json"} </w:instrText>
+        <w:instrText xml:space="preserve"> ADDIN ZOTERO_ITEM CSL_CITATION {"citationID":"yhpP8bT4","properties":{"formattedCitation":"(Gupta, 2023; Wikipedia contributors, 2024a)","plainCitation":"(Gupta, 2023; Wikipedia contributors, 2024a)","noteIndex":0},"citationItems":[{"id":516,"uris":["http://zotero.org/users/14909358/items/RAJTZ6G3"],"itemData":{"id":516,"type":"webpage","abstract":"A Computer Science portal for geeks. It contains well written, well thought and well explained computer science and programming articles, quizzes and practice/competitive programming/company interview Questions.","container-title":"GeeksforGeeks","language":"en-US","note":"section: DSA","title":"Bin Packing Problem (Minimize number of used Bins)","URL":"https://www.geeksforgeeks.org/bin-packing-problem-minimize-number-of-used-bins/","author":[{"family":"Gupta","given":"Dheeraj"}],"accessed":{"date-parts":[["2024",11,2]]},"issued":{"date-parts":[["2023",4,5]]}}},{"id":520,"uris":["http://zotero.org/users/14909358/items/FF9JKN9M"],"itemData":{"id":520,"type":"entry-encyclopedia","abstract":"The bin packing problem is an optimization problem, in which items of different sizes must be packed into a finite number of bins or containers, each of a fixed given capacity, in a way that minimizes the number of bins used. The problem has many applications, such as filling up containers, loading trucks with weight capacity constraints, creating file backups in media, splitting a network prefix into multiple subnets, and technology mapping in FPGA semiconductor chip design.\nComputationally, the problem is NP-hard, and the corresponding decision problem, deciding if items can fit into a specified number of bins, is NP-complete. Despite its worst-case hardness, optimal solutions to very large instances of the problem can be produced with sophisticated algorithms. In addition, many approximation algorithms exist. For example, the first fit algorithm provides a fast but often non-optimal solution, involving placing each item into the first bin in which it will fit. It requires Θ(n log n) time, where n is the number of items to be packed. The algorithm can be made much more effective by first sorting the list of items into decreasing order (sometimes known as the first-fit decreasing algorithm), although this still does not guarantee an optimal solution and for longer lists may increase the running time of the algorithm. It is known, however, that there always exists at least one ordering of items that allows first-fit to produce an optimal solution.\nThere are many variations of this problem, such as 2D packing, linear packing, packing by weight, packing by cost, and so on. The bin packing problem can also be seen as a special case of the cutting stock problem. When the number of bins is restricted to 1 and each item is characterized by both a volume and a value, the problem of maximizing the value of items that can fit in the bin is known as the knapsack problem.\nA variant of bin packing that occurs in practice is when items can share space when packed into a bin. Specifically,  a set of items could occupy less space when packed together than the sum of their individual sizes. This variant is known as VM packing since when virtual machines (VMs) are packed in a server, their total memory requirement could decrease due to pages shared by the VMs that need only be stored once. If items can share space in arbitrary ways, the bin packing problem is hard to even approximate. However, if space sharing fits into a hierarchy, as is the case with memory sharing in virtual machines, the bin packing problem can be efficiently approximated.\nAnother variant of bin packing of interest in practice is the so-called online bin packing. Here the items of different volume are supposed to arrive sequentially, and the decision maker has to decide whether to select and pack the currently observed item, or else to let it pass. Each decision is without recall. In contrast, offline bin packing allows rearranging the items in the hope of achieving a better packing once additional items arrive. This of course requires additional storage for holding the items to be rearranged.","container-title":"Wikipedia","language":"en","license":"Creative Commons Attribution-ShareAlike License","note":"Page Version ID: 1237237290","source":"Wikipedia","title":"Bin packing problem","URL":"https://en.wikipedia.org/wiki/Bin_packing_problem","author":[{"literal":"Wikipedia contributors"}],"accessed":{"date-parts":[["2024",11,2]]},"issued":{"date-parts":[["2024",7,28]]}}}],"schema":"https://github.com/citation-style-language/schema/raw/master/csl-citation.json"} </w:instrText>
       </w:r>
       <w:r>
         <w:fldChar w:fldCharType="separate"/>
@@ -2135,7 +2133,7 @@
         <w:fldChar w:fldCharType="begin"/>
       </w:r>
       <w:r>
-        <w:instrText xml:space="preserve"> ADDIN ZOTERO_ITEM CSL_CITATION {"citationID":"JrQTNHFh","properties":{"formattedCitation":"(Wikipedia contributors, 2024a)","plainCitation":"(Wikipedia contributors, 2024a)","noteIndex":0},"citationItems":[{"id":520,"uris":["http://zotero.org/users/14909358/items/FF9JKN9M"],"itemData":{"id":520,"type":"entry-encyclopedia","abstract":"The bin packing problem is an optimization problem, in which items of different sizes must be packed into a finite number of bins or containers, each of a fixed given capacity, in a way that minimizes the number of bins used. The problem has many applications, such as filling up containers, loading trucks with weight capacity constraints, creating file backups in media, splitting a network prefix into multiple subnets, and technology mapping in FPGA semiconductor chip design.\nComputationally, the problem is NP-hard, and the corresponding decision problem, deciding if items can fit into a specified number of bins, is NP-complete. Despite its worst-case hardness, optimal solutions to very large instances of the problem can be produced with sophisticated algorithms. In addition, many approximation algorithms exist. For example, the first fit algorithm provides a fast but often non-optimal solution, involving placing each item into the first bin in which it will fit. It requires Θ(n log n) time, where n is the number of items to be packed. The algorithm can be made much more effective by first sorting the list of items into decreasing order (sometimes known as the first-fit decreasing algorithm), although this still does not guarantee an optimal solution and for longer lists may increase the running time of the algorithm. It is known, however, that there always exists at least one ordering of items that allows first-fit to produce an optimal solution.\nThere are many variations of this problem, such as 2D packing, linear packing, packing by weight, packing by cost, and so on. The bin packing problem can also be seen as a special case of the cutting stock problem. When the number of bins is restricted to 1 and each item is characterized by both a volume and a value, the problem of maximizing the value of items that can fit in the bin is known as the knapsack problem.\nA variant of bin packing that occurs in practice is when items can share space when packed into a bin. Specifically,  a set of items could occupy less space when packed together than the sum of their individual sizes. This variant is known as VM packing since when virtual machines (VMs) are packed in a server, their total memory requirement could decrease due to pages shared by the VMs that need only be stored once. If items can share space in arbitrary ways, the bin packing problem is hard to even approximate. However, if space sharing fits into a hierarchy, as is the case with memory sharing in virtual machines, the bin packing problem can be efficiently approximated.\nAnother variant of bin packing of interest in practice is the so-called online bin packing. Here the items of different volume are supposed to arrive sequentially, and the decision maker has to decide whether to select and pack the currently observed item, or else to let it pass. Each decision is without recall. In contrast, offline bin packing allows rearranging the items in the hope of achieving a better packing once additional items arrive. This of course requires additional storage for holding the items to be rearranged.","container-title":"Wikipedia","language":"en","license":"Creative Commons Attribution-ShareAlike License","note":"Page Version ID: 1237237290","source":"Wikipedia","title":"Bin packing problem","URL":"https://en.wikipedia.org/w/index.php?title=Bin_packing_problem&amp;oldid=1237237290","author":[{"literal":"Wikipedia contributors"}],"accessed":{"date-parts":[["2024",11,2]]},"issued":{"date-parts":[["2024",7,28]]}}}],"schema":"https://github.com/citation-style-language/schema/raw/master/csl-citation.json"} </w:instrText>
+        <w:instrText xml:space="preserve"> ADDIN ZOTERO_ITEM CSL_CITATION {"citationID":"JrQTNHFh","properties":{"formattedCitation":"(Wikipedia contributors, 2024a)","plainCitation":"(Wikipedia contributors, 2024a)","noteIndex":0},"citationItems":[{"id":520,"uris":["http://zotero.org/users/14909358/items/FF9JKN9M"],"itemData":{"id":520,"type":"entry-encyclopedia","abstract":"The bin packing problem is an optimization problem, in which items of different sizes must be packed into a finite number of bins or containers, each of a fixed given capacity, in a way that minimizes the number of bins used. The problem has many applications, such as filling up containers, loading trucks with weight capacity constraints, creating file backups in media, splitting a network prefix into multiple subnets, and technology mapping in FPGA semiconductor chip design.\nComputationally, the problem is NP-hard, and the corresponding decision problem, deciding if items can fit into a specified number of bins, is NP-complete. Despite its worst-case hardness, optimal solutions to very large instances of the problem can be produced with sophisticated algorithms. In addition, many approximation algorithms exist. For example, the first fit algorithm provides a fast but often non-optimal solution, involving placing each item into the first bin in which it will fit. It requires Θ(n log n) time, where n is the number of items to be packed. The algorithm can be made much more effective by first sorting the list of items into decreasing order (sometimes known as the first-fit decreasing algorithm), although this still does not guarantee an optimal solution and for longer lists may increase the running time of the algorithm. It is known, however, that there always exists at least one ordering of items that allows first-fit to produce an optimal solution.\nThere are many variations of this problem, such as 2D packing, linear packing, packing by weight, packing by cost, and so on. The bin packing problem can also be seen as a special case of the cutting stock problem. When the number of bins is restricted to 1 and each item is characterized by both a volume and a value, the problem of maximizing the value of items that can fit in the bin is known as the knapsack problem.\nA variant of bin packing that occurs in practice is when items can share space when packed into a bin. Specifically,  a set of items could occupy less space when packed together than the sum of their individual sizes. This variant is known as VM packing since when virtual machines (VMs) are packed in a server, their total memory requirement could decrease due to pages shared by the VMs that need only be stored once. If items can share space in arbitrary ways, the bin packing problem is hard to even approximate. However, if space sharing fits into a hierarchy, as is the case with memory sharing in virtual machines, the bin packing problem can be efficiently approximated.\nAnother variant of bin packing of interest in practice is the so-called online bin packing. Here the items of different volume are supposed to arrive sequentially, and the decision maker has to decide whether to select and pack the currently observed item, or else to let it pass. Each decision is without recall. In contrast, offline bin packing allows rearranging the items in the hope of achieving a better packing once additional items arrive. This of course requires additional storage for holding the items to be rearranged.","container-title":"Wikipedia","language":"en","license":"Creative Commons Attribution-ShareAlike License","note":"Page Version ID: 1237237290","source":"Wikipedia","title":"Bin packing problem","URL":"https://en.wikipedia.org/wiki/Bin_packing_problem","author":[{"literal":"Wikipedia contributors"}],"accessed":{"date-parts":[["2024",11,2]]},"issued":{"date-parts":[["2024",7,28]]}}}],"schema":"https://github.com/citation-style-language/schema/raw/master/csl-citation.json"} </w:instrText>
       </w:r>
       <w:r>
         <w:fldChar w:fldCharType="separate"/>
@@ -2200,7 +2198,7 @@
         <w:fldChar w:fldCharType="begin"/>
       </w:r>
       <w:r>
-        <w:instrText xml:space="preserve"> ADDIN ZOTERO_ITEM CSL_CITATION {"citationID":"Seo95710","properties":{"formattedCitation":"(Korf, 2002; Wikipedia contributors, 2024a)","plainCitation":"(Korf, 2002; Wikipedia contributors, 2024a)","noteIndex":0},"citationItems":[{"id":537,"uris":["http://zotero.org/users/14909358/items/XCMZ3I4B"],"itemData":{"id":537,"type":"article-journal","abstract":"We consider the NP-complete problem of bin packing. Given a set of numbers, and a set of bins of ﬁxed capacity, ﬁnd the minimum number of bins needed to contain all the numbers, such that the sum of the numbers assigned to each bin does not exceed the bin capacity. We present a new algorithm for optimal bin packing. Rather than considering the different bins that each number can be placed into, we consider the different ways in which each bin can be packed. Our algorithm appears to be asymptotically faster than the best existing optimal algorithm, and runs more that a thousand times faster on problems with 60 numbers.","language":"en","source":"Zotero","title":"A New Algorithm for Optimal Bin Packing","author":[{"family":"Korf","given":"Richard E"}],"issued":{"date-parts":[["2002"]]}}},{"id":520,"uris":["http://zotero.org/users/14909358/items/FF9JKN9M"],"itemData":{"id":520,"type":"entry-encyclopedia","abstract":"The bin packing problem is an optimization problem, in which items of different sizes must be packed into a finite number of bins or containers, each of a fixed given capacity, in a way that minimizes the number of bins used. The problem has many applications, such as filling up containers, loading trucks with weight capacity constraints, creating file backups in media, splitting a network prefix into multiple subnets, and technology mapping in FPGA semiconductor chip design.\nComputationally, the problem is NP-hard, and the corresponding decision problem, deciding if items can fit into a specified number of bins, is NP-complete. Despite its worst-case hardness, optimal solutions to very large instances of the problem can be produced with sophisticated algorithms. In addition, many approximation algorithms exist. For example, the first fit algorithm provides a fast but often non-optimal solution, involving placing each item into the first bin in which it will fit. It requires Θ(n log n) time, where n is the number of items to be packed. The algorithm can be made much more effective by first sorting the list of items into decreasing order (sometimes known as the first-fit decreasing algorithm), although this still does not guarantee an optimal solution and for longer lists may increase the running time of the algorithm. It is known, however, that there always exists at least one ordering of items that allows first-fit to produce an optimal solution.\nThere are many variations of this problem, such as 2D packing, linear packing, packing by weight, packing by cost, and so on. The bin packing problem can also be seen as a special case of the cutting stock problem. When the number of bins is restricted to 1 and each item is characterized by both a volume and a value, the problem of maximizing the value of items that can fit in the bin is known as the knapsack problem.\nA variant of bin packing that occurs in practice is when items can share space when packed into a bin. Specifically,  a set of items could occupy less space when packed together than the sum of their individual sizes. This variant is known as VM packing since when virtual machines (VMs) are packed in a server, their total memory requirement could decrease due to pages shared by the VMs that need only be stored once. If items can share space in arbitrary ways, the bin packing problem is hard to even approximate. However, if space sharing fits into a hierarchy, as is the case with memory sharing in virtual machines, the bin packing problem can be efficiently approximated.\nAnother variant of bin packing of interest in practice is the so-called online bin packing. Here the items of different volume are supposed to arrive sequentially, and the decision maker has to decide whether to select and pack the currently observed item, or else to let it pass. Each decision is without recall. In contrast, offline bin packing allows rearranging the items in the hope of achieving a better packing once additional items arrive. This of course requires additional storage for holding the items to be rearranged.","container-title":"Wikipedia","language":"en","license":"Creative Commons Attribution-ShareAlike License","note":"Page Version ID: 1237237290","source":"Wikipedia","title":"Bin packing problem","URL":"https://en.wikipedia.org/w/index.php?title=Bin_packing_problem&amp;oldid=1237237290","author":[{"literal":"Wikipedia contributors"}],"accessed":{"date-parts":[["2024",11,2]]},"issued":{"date-parts":[["2024",7,28]]}}}],"schema":"https://github.com/citation-style-language/schema/raw/master/csl-citation.json"} </w:instrText>
+        <w:instrText xml:space="preserve"> ADDIN ZOTERO_ITEM CSL_CITATION {"citationID":"Seo95710","properties":{"formattedCitation":"(Korf, 2002; Wikipedia contributors, 2024a)","plainCitation":"(Korf, 2002; Wikipedia contributors, 2024a)","noteIndex":0},"citationItems":[{"id":537,"uris":["http://zotero.org/users/14909358/items/XCMZ3I4B"],"itemData":{"id":537,"type":"article-journal","abstract":"We consider the NP-complete problem of bin packing. Given a set of numbers, and a set of bins of ﬁxed capacity, ﬁnd the minimum number of bins needed to contain all the numbers, such that the sum of the numbers assigned to each bin does not exceed the bin capacity. We present a new algorithm for optimal bin packing. Rather than considering the different bins that each number can be placed into, we consider the different ways in which each bin can be packed. Our algorithm appears to be asymptotically faster than the best existing optimal algorithm, and runs more that a thousand times faster on problems with 60 numbers.","language":"en","source":"Zotero","title":"A New Algorithm for Optimal Bin Packing","author":[{"family":"Korf","given":"Richard E"}],"issued":{"date-parts":[["2002"]]}}},{"id":520,"uris":["http://zotero.org/users/14909358/items/FF9JKN9M"],"itemData":{"id":520,"type":"entry-encyclopedia","abstract":"The bin packing problem is an optimization problem, in which items of different sizes must be packed into a finite number of bins or containers, each of a fixed given capacity, in a way that minimizes the number of bins used. The problem has many applications, such as filling up containers, loading trucks with weight capacity constraints, creating file backups in media, splitting a network prefix into multiple subnets, and technology mapping in FPGA semiconductor chip design.\nComputationally, the problem is NP-hard, and the corresponding decision problem, deciding if items can fit into a specified number of bins, is NP-complete. Despite its worst-case hardness, optimal solutions to very large instances of the problem can be produced with sophisticated algorithms. In addition, many approximation algorithms exist. For example, the first fit algorithm provides a fast but often non-optimal solution, involving placing each item into the first bin in which it will fit. It requires Θ(n log n) time, where n is the number of items to be packed. The algorithm can be made much more effective by first sorting the list of items into decreasing order (sometimes known as the first-fit decreasing algorithm), although this still does not guarantee an optimal solution and for longer lists may increase the running time of the algorithm. It is known, however, that there always exists at least one ordering of items that allows first-fit to produce an optimal solution.\nThere are many variations of this problem, such as 2D packing, linear packing, packing by weight, packing by cost, and so on. The bin packing problem can also be seen as a special case of the cutting stock problem. When the number of bins is restricted to 1 and each item is characterized by both a volume and a value, the problem of maximizing the value of items that can fit in the bin is known as the knapsack problem.\nA variant of bin packing that occurs in practice is when items can share space when packed into a bin. Specifically,  a set of items could occupy less space when packed together than the sum of their individual sizes. This variant is known as VM packing since when virtual machines (VMs) are packed in a server, their total memory requirement could decrease due to pages shared by the VMs that need only be stored once. If items can share space in arbitrary ways, the bin packing problem is hard to even approximate. However, if space sharing fits into a hierarchy, as is the case with memory sharing in virtual machines, the bin packing problem can be efficiently approximated.\nAnother variant of bin packing of interest in practice is the so-called online bin packing. Here the items of different volume are supposed to arrive sequentially, and the decision maker has to decide whether to select and pack the currently observed item, or else to let it pass. Each decision is without recall. In contrast, offline bin packing allows rearranging the items in the hope of achieving a better packing once additional items arrive. This of course requires additional storage for holding the items to be rearranged.","container-title":"Wikipedia","language":"en","license":"Creative Commons Attribution-ShareAlike License","note":"Page Version ID: 1237237290","source":"Wikipedia","title":"Bin packing problem","URL":"https://en.wikipedia.org/wiki/Bin_packing_problem","author":[{"literal":"Wikipedia contributors"}],"accessed":{"date-parts":[["2024",11,2]]},"issued":{"date-parts":[["2024",7,28]]}}}],"schema":"https://github.com/citation-style-language/schema/raw/master/csl-citation.json"} </w:instrText>
       </w:r>
       <w:r>
         <w:fldChar w:fldCharType="separate"/>
@@ -2313,7 +2311,7 @@
         <w:fldChar w:fldCharType="begin"/>
       </w:r>
       <w:r>
-        <w:instrText xml:space="preserve"> ADDIN ZOTERO_ITEM CSL_CITATION {"citationID":"ukrlZQIL","properties":{"formattedCitation":"(Gupta, 2023; Korf, 2002; Wikipedia contributors, 2024a)","plainCitation":"(Gupta, 2023; Korf, 2002; Wikipedia contributors, 2024a)","noteIndex":0},"citationItems":[{"id":516,"uris":["http://zotero.org/users/14909358/items/RAJTZ6G3"],"itemData":{"id":516,"type":"webpage","abstract":"A Computer Science portal for geeks. It contains well written, well thought and well explained computer science and programming articles, quizzes and practice/competitive programming/company interview Questions.","container-title":"GeeksforGeeks","language":"en-US","note":"section: DSA","title":"Bin Packing Problem (Minimize number of used Bins)","URL":"https://www.geeksforgeeks.org/bin-packing-problem-minimize-number-of-used-bins/","author":[{"family":"Gupta","given":"Dheeraj"}],"accessed":{"date-parts":[["2024",11,2]]},"issued":{"date-parts":[["2023",4,5]]}}},{"id":537,"uris":["http://zotero.org/users/14909358/items/XCMZ3I4B"],"itemData":{"id":537,"type":"article-journal","abstract":"We consider the NP-complete problem of bin packing. Given a set of numbers, and a set of bins of ﬁxed capacity, ﬁnd the minimum number of bins needed to contain all the numbers, such that the sum of the numbers assigned to each bin does not exceed the bin capacity. We present a new algorithm for optimal bin packing. Rather than considering the different bins that each number can be placed into, we consider the different ways in which each bin can be packed. Our algorithm appears to be asymptotically faster than the best existing optimal algorithm, and runs more that a thousand times faster on problems with 60 numbers.","language":"en","source":"Zotero","title":"A New Algorithm for Optimal Bin Packing","author":[{"family":"Korf","given":"Richard E"}],"issued":{"date-parts":[["2002"]]}}},{"id":520,"uris":["http://zotero.org/users/14909358/items/FF9JKN9M"],"itemData":{"id":520,"type":"entry-encyclopedia","abstract":"The bin packing problem is an optimization problem, in which items of different sizes must be packed into a finite number of bins or containers, each of a fixed given capacity, in a way that minimizes the number of bins used. The problem has many applications, such as filling up containers, loading trucks with weight capacity constraints, creating file backups in media, splitting a network prefix into multiple subnets, and technology mapping in FPGA semiconductor chip design.\nComputationally, the problem is NP-hard, and the corresponding decision problem, deciding if items can fit into a specified number of bins, is NP-complete. Despite its worst-case hardness, optimal solutions to very large instances of the problem can be produced with sophisticated algorithms. In addition, many approximation algorithms exist. For example, the first fit algorithm provides a fast but often non-optimal solution, involving placing each item into the first bin in which it will fit. It requires Θ(n log n) time, where n is the number of items to be packed. The algorithm can be made much more effective by first sorting the list of items into decreasing order (sometimes known as the first-fit decreasing algorithm), although this still does not guarantee an optimal solution and for longer lists may increase the running time of the algorithm. It is known, however, that there always exists at least one ordering of items that allows first-fit to produce an optimal solution.\nThere are many variations of this problem, such as 2D packing, linear packing, packing by weight, packing by cost, and so on. The bin packing problem can also be seen as a special case of the cutting stock problem. When the number of bins is restricted to 1 and each item is characterized by both a volume and a value, the problem of maximizing the value of items that can fit in the bin is known as the knapsack problem.\nA variant of bin packing that occurs in practice is when items can share space when packed into a bin. Specifically,  a set of items could occupy less space when packed together than the sum of their individual sizes. This variant is known as VM packing since when virtual machines (VMs) are packed in a server, their total memory requirement could decrease due to pages shared by the VMs that need only be stored once. If items can share space in arbitrary ways, the bin packing problem is hard to even approximate. However, if space sharing fits into a hierarchy, as is the case with memory sharing in virtual machines, the bin packing problem can be efficiently approximated.\nAnother variant of bin packing of interest in practice is the so-called online bin packing. Here the items of different volume are supposed to arrive sequentially, and the decision maker has to decide whether to select and pack the currently observed item, or else to let it pass. Each decision is without recall. In contrast, offline bin packing allows rearranging the items in the hope of achieving a better packing once additional items arrive. This of course requires additional storage for holding the items to be rearranged.","container-title":"Wikipedia","language":"en","license":"Creative Commons Attribution-ShareAlike License","note":"Page Version ID: 1237237290","source":"Wikipedia","title":"Bin packing problem","URL":"https://en.wikipedia.org/w/index.php?title=Bin_packing_problem&amp;oldid=1237237290","author":[{"literal":"Wikipedia contributors"}],"accessed":{"date-parts":[["2024",11,2]]},"issued":{"date-parts":[["2024",7,28]]}}}],"schema":"https://github.com/citation-style-language/schema/raw/master/csl-citation.json"} </w:instrText>
+        <w:instrText xml:space="preserve"> ADDIN ZOTERO_ITEM CSL_CITATION {"citationID":"ukrlZQIL","properties":{"formattedCitation":"(Gupta, 2023; Korf, 2002; Wikipedia contributors, 2024a)","plainCitation":"(Gupta, 2023; Korf, 2002; Wikipedia contributors, 2024a)","noteIndex":0},"citationItems":[{"id":516,"uris":["http://zotero.org/users/14909358/items/RAJTZ6G3"],"itemData":{"id":516,"type":"webpage","abstract":"A Computer Science portal for geeks. It contains well written, well thought and well explained computer science and programming articles, quizzes and practice/competitive programming/company interview Questions.","container-title":"GeeksforGeeks","language":"en-US","note":"section: DSA","title":"Bin Packing Problem (Minimize number of used Bins)","URL":"https://www.geeksforgeeks.org/bin-packing-problem-minimize-number-of-used-bins/","author":[{"family":"Gupta","given":"Dheeraj"}],"accessed":{"date-parts":[["2024",11,2]]},"issued":{"date-parts":[["2023",4,5]]}}},{"id":537,"uris":["http://zotero.org/users/14909358/items/XCMZ3I4B"],"itemData":{"id":537,"type":"article-journal","abstract":"We consider the NP-complete problem of bin packing. Given a set of numbers, and a set of bins of ﬁxed capacity, ﬁnd the minimum number of bins needed to contain all the numbers, such that the sum of the numbers assigned to each bin does not exceed the bin capacity. We present a new algorithm for optimal bin packing. Rather than considering the different bins that each number can be placed into, we consider the different ways in which each bin can be packed. Our algorithm appears to be asymptotically faster than the best existing optimal algorithm, and runs more that a thousand times faster on problems with 60 numbers.","language":"en","source":"Zotero","title":"A New Algorithm for Optimal Bin Packing","author":[{"family":"Korf","given":"Richard E"}],"issued":{"date-parts":[["2002"]]}}},{"id":520,"uris":["http://zotero.org/users/14909358/items/FF9JKN9M"],"itemData":{"id":520,"type":"entry-encyclopedia","abstract":"The bin packing problem is an optimization problem, in which items of different sizes must be packed into a finite number of bins or containers, each of a fixed given capacity, in a way that minimizes the number of bins used. The problem has many applications, such as filling up containers, loading trucks with weight capacity constraints, creating file backups in media, splitting a network prefix into multiple subnets, and technology mapping in FPGA semiconductor chip design.\nComputationally, the problem is NP-hard, and the corresponding decision problem, deciding if items can fit into a specified number of bins, is NP-complete. Despite its worst-case hardness, optimal solutions to very large instances of the problem can be produced with sophisticated algorithms. In addition, many approximation algorithms exist. For example, the first fit algorithm provides a fast but often non-optimal solution, involving placing each item into the first bin in which it will fit. It requires Θ(n log n) time, where n is the number of items to be packed. The algorithm can be made much more effective by first sorting the list of items into decreasing order (sometimes known as the first-fit decreasing algorithm), although this still does not guarantee an optimal solution and for longer lists may increase the running time of the algorithm. It is known, however, that there always exists at least one ordering of items that allows first-fit to produce an optimal solution.\nThere are many variations of this problem, such as 2D packing, linear packing, packing by weight, packing by cost, and so on. The bin packing problem can also be seen as a special case of the cutting stock problem. When the number of bins is restricted to 1 and each item is characterized by both a volume and a value, the problem of maximizing the value of items that can fit in the bin is known as the knapsack problem.\nA variant of bin packing that occurs in practice is when items can share space when packed into a bin. Specifically,  a set of items could occupy less space when packed together than the sum of their individual sizes. This variant is known as VM packing since when virtual machines (VMs) are packed in a server, their total memory requirement could decrease due to pages shared by the VMs that need only be stored once. If items can share space in arbitrary ways, the bin packing problem is hard to even approximate. However, if space sharing fits into a hierarchy, as is the case with memory sharing in virtual machines, the bin packing problem can be efficiently approximated.\nAnother variant of bin packing of interest in practice is the so-called online bin packing. Here the items of different volume are supposed to arrive sequentially, and the decision maker has to decide whether to select and pack the currently observed item, or else to let it pass. Each decision is without recall. In contrast, offline bin packing allows rearranging the items in the hope of achieving a better packing once additional items arrive. This of course requires additional storage for holding the items to be rearranged.","container-title":"Wikipedia","language":"en","license":"Creative Commons Attribution-ShareAlike License","note":"Page Version ID: 1237237290","source":"Wikipedia","title":"Bin packing problem","URL":"https://en.wikipedia.org/wiki/Bin_packing_problem","author":[{"literal":"Wikipedia contributors"}],"accessed":{"date-parts":[["2024",11,2]]},"issued":{"date-parts":[["2024",7,28]]}}}],"schema":"https://github.com/citation-style-language/schema/raw/master/csl-citation.json"} </w:instrText>
       </w:r>
       <w:r>
         <w:fldChar w:fldCharType="separate"/>
@@ -2352,7 +2350,7 @@
         <w:fldChar w:fldCharType="begin"/>
       </w:r>
       <w:r>
-        <w:instrText xml:space="preserve"> ADDIN ZOTERO_ITEM CSL_CITATION {"citationID":"INVma1Nz","properties":{"formattedCitation":"(Gupta, 2023; Wikipedia contributors, 2024a)","plainCitation":"(Gupta, 2023; Wikipedia contributors, 2024a)","noteIndex":0},"citationItems":[{"id":516,"uris":["http://zotero.org/users/14909358/items/RAJTZ6G3"],"itemData":{"id":516,"type":"webpage","abstract":"A Computer Science portal for geeks. It contains well written, well thought and well explained computer science and programming articles, quizzes and practice/competitive programming/company interview Questions.","container-title":"GeeksforGeeks","language":"en-US","note":"section: DSA","title":"Bin Packing Problem (Minimize number of used Bins)","URL":"https://www.geeksforgeeks.org/bin-packing-problem-minimize-number-of-used-bins/","author":[{"family":"Gupta","given":"Dheeraj"}],"accessed":{"date-parts":[["2024",11,2]]},"issued":{"date-parts":[["2023",4,5]]}}},{"id":520,"uris":["http://zotero.org/users/14909358/items/FF9JKN9M"],"itemData":{"id":520,"type":"entry-encyclopedia","abstract":"The bin packing problem is an optimization problem, in which items of different sizes must be packed into a finite number of bins or containers, each of a fixed given capacity, in a way that minimizes the number of bins used. The problem has many applications, such as filling up containers, loading trucks with weight capacity constraints, creating file backups in media, splitting a network prefix into multiple subnets, and technology mapping in FPGA semiconductor chip design.\nComputationally, the problem is NP-hard, and the corresponding decision problem, deciding if items can fit into a specified number of bins, is NP-complete. Despite its worst-case hardness, optimal solutions to very large instances of the problem can be produced with sophisticated algorithms. In addition, many approximation algorithms exist. For example, the first fit algorithm provides a fast but often non-optimal solution, involving placing each item into the first bin in which it will fit. It requires Θ(n log n) time, where n is the number of items to be packed. The algorithm can be made much more effective by first sorting the list of items into decreasing order (sometimes known as the first-fit decreasing algorithm), although this still does not guarantee an optimal solution and for longer lists may increase the running time of the algorithm. It is known, however, that there always exists at least one ordering of items that allows first-fit to produce an optimal solution.\nThere are many variations of this problem, such as 2D packing, linear packing, packing by weight, packing by cost, and so on. The bin packing problem can also be seen as a special case of the cutting stock problem. When the number of bins is restricted to 1 and each item is characterized by both a volume and a value, the problem of maximizing the value of items that can fit in the bin is known as the knapsack problem.\nA variant of bin packing that occurs in practice is when items can share space when packed into a bin. Specifically,  a set of items could occupy less space when packed together than the sum of their individual sizes. This variant is known as VM packing since when virtual machines (VMs) are packed in a server, their total memory requirement could decrease due to pages shared by the VMs that need only be stored once. If items can share space in arbitrary ways, the bin packing problem is hard to even approximate. However, if space sharing fits into a hierarchy, as is the case with memory sharing in virtual machines, the bin packing problem can be efficiently approximated.\nAnother variant of bin packing of interest in practice is the so-called online bin packing. Here the items of different volume are supposed to arrive sequentially, and the decision maker has to decide whether to select and pack the currently observed item, or else to let it pass. Each decision is without recall. In contrast, offline bin packing allows rearranging the items in the hope of achieving a better packing once additional items arrive. This of course requires additional storage for holding the items to be rearranged.","container-title":"Wikipedia","language":"en","license":"Creative Commons Attribution-ShareAlike License","note":"Page Version ID: 1237237290","source":"Wikipedia","title":"Bin packing problem","URL":"https://en.wikipedia.org/w/index.php?title=Bin_packing_problem&amp;oldid=1237237290","author":[{"literal":"Wikipedia contributors"}],"accessed":{"date-parts":[["2024",11,2]]},"issued":{"date-parts":[["2024",7,28]]}}}],"schema":"https://github.com/citation-style-language/schema/raw/master/csl-citation.json"} </w:instrText>
+        <w:instrText xml:space="preserve"> ADDIN ZOTERO_ITEM CSL_CITATION {"citationID":"INVma1Nz","properties":{"formattedCitation":"(Gupta, 2023; Wikipedia contributors, 2024a)","plainCitation":"(Gupta, 2023; Wikipedia contributors, 2024a)","noteIndex":0},"citationItems":[{"id":516,"uris":["http://zotero.org/users/14909358/items/RAJTZ6G3"],"itemData":{"id":516,"type":"webpage","abstract":"A Computer Science portal for geeks. It contains well written, well thought and well explained computer science and programming articles, quizzes and practice/competitive programming/company interview Questions.","container-title":"GeeksforGeeks","language":"en-US","note":"section: DSA","title":"Bin Packing Problem (Minimize number of used Bins)","URL":"https://www.geeksforgeeks.org/bin-packing-problem-minimize-number-of-used-bins/","author":[{"family":"Gupta","given":"Dheeraj"}],"accessed":{"date-parts":[["2024",11,2]]},"issued":{"date-parts":[["2023",4,5]]}}},{"id":520,"uris":["http://zotero.org/users/14909358/items/FF9JKN9M"],"itemData":{"id":520,"type":"entry-encyclopedia","abstract":"The bin packing problem is an optimization problem, in which items of different sizes must be packed into a finite number of bins or containers, each of a fixed given capacity, in a way that minimizes the number of bins used. The problem has many applications, such as filling up containers, loading trucks with weight capacity constraints, creating file backups in media, splitting a network prefix into multiple subnets, and technology mapping in FPGA semiconductor chip design.\nComputationally, the problem is NP-hard, and the corresponding decision problem, deciding if items can fit into a specified number of bins, is NP-complete. Despite its worst-case hardness, optimal solutions to very large instances of the problem can be produced with sophisticated algorithms. In addition, many approximation algorithms exist. For example, the first fit algorithm provides a fast but often non-optimal solution, involving placing each item into the first bin in which it will fit. It requires Θ(n log n) time, where n is the number of items to be packed. The algorithm can be made much more effective by first sorting the list of items into decreasing order (sometimes known as the first-fit decreasing algorithm), although this still does not guarantee an optimal solution and for longer lists may increase the running time of the algorithm. It is known, however, that there always exists at least one ordering of items that allows first-fit to produce an optimal solution.\nThere are many variations of this problem, such as 2D packing, linear packing, packing by weight, packing by cost, and so on. The bin packing problem can also be seen as a special case of the cutting stock problem. When the number of bins is restricted to 1 and each item is characterized by both a volume and a value, the problem of maximizing the value of items that can fit in the bin is known as the knapsack problem.\nA variant of bin packing that occurs in practice is when items can share space when packed into a bin. Specifically,  a set of items could occupy less space when packed together than the sum of their individual sizes. This variant is known as VM packing since when virtual machines (VMs) are packed in a server, their total memory requirement could decrease due to pages shared by the VMs that need only be stored once. If items can share space in arbitrary ways, the bin packing problem is hard to even approximate. However, if space sharing fits into a hierarchy, as is the case with memory sharing in virtual machines, the bin packing problem can be efficiently approximated.\nAnother variant of bin packing of interest in practice is the so-called online bin packing. Here the items of different volume are supposed to arrive sequentially, and the decision maker has to decide whether to select and pack the currently observed item, or else to let it pass. Each decision is without recall. In contrast, offline bin packing allows rearranging the items in the hope of achieving a better packing once additional items arrive. This of course requires additional storage for holding the items to be rearranged.","container-title":"Wikipedia","language":"en","license":"Creative Commons Attribution-ShareAlike License","note":"Page Version ID: 1237237290","source":"Wikipedia","title":"Bin packing problem","URL":"https://en.wikipedia.org/wiki/Bin_packing_problem","author":[{"literal":"Wikipedia contributors"}],"accessed":{"date-parts":[["2024",11,2]]},"issued":{"date-parts":[["2024",7,28]]}}}],"schema":"https://github.com/citation-style-language/schema/raw/master/csl-citation.json"} </w:instrText>
       </w:r>
       <w:r>
         <w:fldChar w:fldCharType="separate"/>
@@ -2378,7 +2376,7 @@
       <w:pPr>
         <w:pStyle w:val="Heading1"/>
       </w:pPr>
-      <w:bookmarkStart w:id="5" w:name="_Toc182126653"/>
+      <w:bookmarkStart w:id="5" w:name="_Toc182129269"/>
       <w:r>
         <w:t>Our Implementation – Assumptions, Modifications &amp; Restrictions</w:t>
       </w:r>
@@ -2389,7 +2387,7 @@
       <w:pPr>
         <w:pStyle w:val="Heading2"/>
       </w:pPr>
-      <w:bookmarkStart w:id="6" w:name="_Toc182126654"/>
+      <w:bookmarkStart w:id="6" w:name="_Toc182129270"/>
       <w:r>
         <w:t>Assumptions</w:t>
       </w:r>
@@ -2502,7 +2500,7 @@
       <w:pPr>
         <w:pStyle w:val="Heading2"/>
       </w:pPr>
-      <w:bookmarkStart w:id="7" w:name="_Toc182126655"/>
+      <w:bookmarkStart w:id="7" w:name="_Toc182129271"/>
       <w:r>
         <w:lastRenderedPageBreak/>
         <w:t>Modifications</w:t>
@@ -2517,7 +2515,7 @@
       <w:pPr>
         <w:pStyle w:val="Heading3"/>
       </w:pPr>
-      <w:bookmarkStart w:id="8" w:name="_Toc182126656"/>
+      <w:bookmarkStart w:id="8" w:name="_Toc182129272"/>
       <w:r>
         <w:t>Sorting Items in Decreasing Order</w:t>
       </w:r>
@@ -2713,7 +2711,7 @@
       <w:r>
         <w:t xml:space="preserve"> </w:t>
       </w:r>
-      <w:bookmarkStart w:id="9" w:name="_Toc182126657"/>
+      <w:bookmarkStart w:id="9" w:name="_Toc182129273"/>
       <w:r>
         <w:t>Fixed Bin Capacity (Restriction)</w:t>
       </w:r>
@@ -2828,7 +2826,7 @@
       <w:pPr>
         <w:pStyle w:val="Heading3"/>
       </w:pPr>
-      <w:bookmarkStart w:id="10" w:name="_Toc182126658"/>
+      <w:bookmarkStart w:id="10" w:name="_Toc182129274"/>
       <w:r>
         <w:t>Rejection of Oversized Items (Restriction)</w:t>
       </w:r>
@@ -2919,7 +2917,7 @@
       <w:pPr>
         <w:pStyle w:val="Heading3"/>
       </w:pPr>
-      <w:bookmarkStart w:id="11" w:name="_Toc182126659"/>
+      <w:bookmarkStart w:id="11" w:name="_Toc182129275"/>
       <w:r>
         <w:t>Absence of Bin Rebalancing (Restriction)</w:t>
       </w:r>
@@ -3007,7 +3005,7 @@
       <w:pPr>
         <w:pStyle w:val="Heading1"/>
       </w:pPr>
-      <w:bookmarkStart w:id="12" w:name="_Toc182126660"/>
+      <w:bookmarkStart w:id="12" w:name="_Toc182129276"/>
       <w:r>
         <w:t>Outline of Algorithms</w:t>
       </w:r>
@@ -3196,7 +3194,7 @@
         <w:fldChar w:fldCharType="begin"/>
       </w:r>
       <w:r>
-        <w:instrText xml:space="preserve"> ADDIN ZOTERO_ITEM CSL_CITATION {"citationID":"9D3JvwIJ","properties":{"formattedCitation":"(Wikipedia contributors, 2024a, 2024b)","plainCitation":"(Wikipedia contributors, 2024a, 2024b)","noteIndex":0},"citationItems":[{"id":520,"uris":["http://zotero.org/users/14909358/items/FF9JKN9M"],"itemData":{"id":520,"type":"entry-encyclopedia","abstract":"The bin packing problem is an optimization problem, in which items of different sizes must be packed into a finite number of bins or containers, each of a fixed given capacity, in a way that minimizes the number of bins used. The problem has many applications, such as filling up containers, loading trucks with weight capacity constraints, creating file backups in media, splitting a network prefix into multiple subnets, and technology mapping in FPGA semiconductor chip design.\nComputationally, the problem is NP-hard, and the corresponding decision problem, deciding if items can fit into a specified number of bins, is NP-complete. Despite its worst-case hardness, optimal solutions to very large instances of the problem can be produced with sophisticated algorithms. In addition, many approximation algorithms exist. For example, the first fit algorithm provides a fast but often non-optimal solution, involving placing each item into the first bin in which it will fit. It requires Θ(n log n) time, where n is the number of items to be packed. The algorithm can be made much more effective by first sorting the list of items into decreasing order (sometimes known as the first-fit decreasing algorithm), although this still does not guarantee an optimal solution and for longer lists may increase the running time of the algorithm. It is known, however, that there always exists at least one ordering of items that allows first-fit to produce an optimal solution.\nThere are many variations of this problem, such as 2D packing, linear packing, packing by weight, packing by cost, and so on. The bin packing problem can also be seen as a special case of the cutting stock problem. When the number of bins is restricted to 1 and each item is characterized by both a volume and a value, the problem of maximizing the value of items that can fit in the bin is known as the knapsack problem.\nA variant of bin packing that occurs in practice is when items can share space when packed into a bin. Specifically,  a set of items could occupy less space when packed together than the sum of their individual sizes. This variant is known as VM packing since when virtual machines (VMs) are packed in a server, their total memory requirement could decrease due to pages shared by the VMs that need only be stored once. If items can share space in arbitrary ways, the bin packing problem is hard to even approximate. However, if space sharing fits into a hierarchy, as is the case with memory sharing in virtual machines, the bin packing problem can be efficiently approximated.\nAnother variant of bin packing of interest in practice is the so-called online bin packing. Here the items of different volume are supposed to arrive sequentially, and the decision maker has to decide whether to select and pack the currently observed item, or else to let it pass. Each decision is without recall. In contrast, offline bin packing allows rearranging the items in the hope of achieving a better packing once additional items arrive. This of course requires additional storage for holding the items to be rearranged.","container-title":"Wikipedia","language":"en","license":"Creative Commons Attribution-ShareAlike License","note":"Page Version ID: 1237237290","source":"Wikipedia","title":"Bin packing problem","URL":"https://en.wikipedia.org/w/index.php?title=Bin_packing_problem&amp;oldid=1237237290","author":[{"literal":"Wikipedia contributors"}],"accessed":{"date-parts":[["2024",11,2]]},"issued":{"date-parts":[["2024",7,28]]}}},{"id":534,"uris":["http://zotero.org/users/14909358/items/W5P8UKHQ"],"itemData":{"id":534,"type":"entry-encyclopedia","abstract":"First-fit-decreasing (FFD) is an algorithm for bin packing. Its input is a list of items of different sizes. Its output is a packing - a partition of the items into bins of fixed capacity, such that the sum of sizes of items in each bin is at most the capacity. Ideally, we would like to use as few bins as possible, but minimizing the number of bins is an NP-hard problem, so we use an approximately-optimal heuristic.","container-title":"Wikipedia","language":"en","license":"Creative Commons Attribution-ShareAlike License","note":"Page Version ID: 1210055959","source":"Wikipedia","title":"First-fit-decreasing bin packing","URL":"https://en.wikipedia.org/w/index.php?title=First-fit-decreasing_bin_packing&amp;oldid=1210055959","author":[{"literal":"Wikipedia contributors"}],"accessed":{"date-parts":[["2024",11,5]]},"issued":{"date-parts":[["2024",2,24]]}}}],"schema":"https://github.com/citation-style-language/schema/raw/master/csl-citation.json"} </w:instrText>
+        <w:instrText xml:space="preserve"> ADDIN ZOTERO_ITEM CSL_CITATION {"citationID":"9D3JvwIJ","properties":{"formattedCitation":"(Wikipedia contributors, 2024a, 2024b)","plainCitation":"(Wikipedia contributors, 2024a, 2024b)","noteIndex":0},"citationItems":[{"id":520,"uris":["http://zotero.org/users/14909358/items/FF9JKN9M"],"itemData":{"id":520,"type":"entry-encyclopedia","abstract":"The bin packing problem is an optimization problem, in which items of different sizes must be packed into a finite number of bins or containers, each of a fixed given capacity, in a way that minimizes the number of bins used. The problem has many applications, such as filling up containers, loading trucks with weight capacity constraints, creating file backups in media, splitting a network prefix into multiple subnets, and technology mapping in FPGA semiconductor chip design.\nComputationally, the problem is NP-hard, and the corresponding decision problem, deciding if items can fit into a specified number of bins, is NP-complete. Despite its worst-case hardness, optimal solutions to very large instances of the problem can be produced with sophisticated algorithms. In addition, many approximation algorithms exist. For example, the first fit algorithm provides a fast but often non-optimal solution, involving placing each item into the first bin in which it will fit. It requires Θ(n log n) time, where n is the number of items to be packed. The algorithm can be made much more effective by first sorting the list of items into decreasing order (sometimes known as the first-fit decreasing algorithm), although this still does not guarantee an optimal solution and for longer lists may increase the running time of the algorithm. It is known, however, that there always exists at least one ordering of items that allows first-fit to produce an optimal solution.\nThere are many variations of this problem, such as 2D packing, linear packing, packing by weight, packing by cost, and so on. The bin packing problem can also be seen as a special case of the cutting stock problem. When the number of bins is restricted to 1 and each item is characterized by both a volume and a value, the problem of maximizing the value of items that can fit in the bin is known as the knapsack problem.\nA variant of bin packing that occurs in practice is when items can share space when packed into a bin. Specifically,  a set of items could occupy less space when packed together than the sum of their individual sizes. This variant is known as VM packing since when virtual machines (VMs) are packed in a server, their total memory requirement could decrease due to pages shared by the VMs that need only be stored once. If items can share space in arbitrary ways, the bin packing problem is hard to even approximate. However, if space sharing fits into a hierarchy, as is the case with memory sharing in virtual machines, the bin packing problem can be efficiently approximated.\nAnother variant of bin packing of interest in practice is the so-called online bin packing. Here the items of different volume are supposed to arrive sequentially, and the decision maker has to decide whether to select and pack the currently observed item, or else to let it pass. Each decision is without recall. In contrast, offline bin packing allows rearranging the items in the hope of achieving a better packing once additional items arrive. This of course requires additional storage for holding the items to be rearranged.","container-title":"Wikipedia","language":"en","license":"Creative Commons Attribution-ShareAlike License","note":"Page Version ID: 1237237290","source":"Wikipedia","title":"Bin packing problem","URL":"https://en.wikipedia.org/wiki/Bin_packing_problem","author":[{"literal":"Wikipedia contributors"}],"accessed":{"date-parts":[["2024",11,2]]},"issued":{"date-parts":[["2024",7,28]]}}},{"id":534,"uris":["http://zotero.org/users/14909358/items/W5P8UKHQ"],"itemData":{"id":534,"type":"entry-encyclopedia","abstract":"First-fit-decreasing (FFD) is an algorithm for bin packing. Its input is a list of items of different sizes. Its output is a packing - a partition of the items into bins of fixed capacity, such that the sum of sizes of items in each bin is at most the capacity. Ideally, we would like to use as few bins as possible, but minimizing the number of bins is an NP-hard problem, so we use an approximately-optimal heuristic.","container-title":"Wikipedia","language":"en","license":"Creative Commons Attribution-ShareAlike License","note":"Page Version ID: 1210055959","source":"Wikipedia","title":"First-fit-decreasing bin packing","URL":"https://en.wikipedia.org/w/index.php?title=First-fit-decreasing_bin_packing&amp;oldid=1210055959","author":[{"literal":"Wikipedia contributors"}],"accessed":{"date-parts":[["2024",11,5]]},"issued":{"date-parts":[["2024",2,24]]}}}],"schema":"https://github.com/citation-style-language/schema/raw/master/csl-citation.json"} </w:instrText>
       </w:r>
       <w:r>
         <w:fldChar w:fldCharType="separate"/>
@@ -3278,95 +3276,75 @@
         <w:fldChar w:fldCharType="begin"/>
       </w:r>
       <w:r>
-        <w:instrText xml:space="preserve"> ADDIN ZOTERO_ITEM CSL_CITATION {"citationID":"XP8RLdAy","properties":{"formattedCitation":"(Jones, n.d.; Wikipedia contributors, 2023)","plainCitation":"(Jones, n.d.; Wikipedia contributors, 2023)","noteIndex":0},"citationItems":[{"id":533,"uris":["http://zotero.org/users/14909358/items/XBM5Z7N2"],"itemData":{"id":533,"type":"entry-encyclopedia","abstract":"Best-fit is an online algorithm for bin packing. Its input is a list of items of different sizes. Its output is a packing - a partition of the items into bins of fixed capacity, such that the sum of sizes of items in each bin is at most the capacity. Ideally, we would like to use as few bins as possible, but minimizing the number of bins is an NP-hard problem. The best-fit algorithm uses the following heuristic:\n\nIt keeps a list of open bins, which is initially empty.\nWhen an item arrives, it finds the bin with the maximum load into which the item can fit, if any. The load of a bin is defined as the sum of sizes of existing items in the bin before placing the new item.\nIf such a bin is found, the new item is placed inside it.\nOtherwise, a new bin is opened and the coming item is placed inside it.","container-title":"Wikipedia","language":"en","license":"Creative Commons Attribution-ShareAlike License","note":"Page Version ID: 1190559703","source":"Wikipedia","title":"Best-fit bin packing","URL":"https://en.wikipedia.org/w/index.php?title=Best-fit_bin_packing&amp;oldid=1190559703","author":[{"literal":"Wikipedia contributors"}],"accessed":{"date-parts":[["2024",11,5]]},"issued":{"date-parts":[["2023",12,18]]}}},{"id":530,"uris":["http://zotero.org/users/14909358/items/53JTN7KV"],"itemData":{"id":530,"type":"webpage","container-title":"Eisah Jones","language":"en-US","title":"Bin-Packing Algorithms","URL":"https://www.eisahjones.com/sorting-algorithms","author":[{"family":"Jones","given":"Eisah"}],"accessed":{"date-parts":[["2024",11,2]]}}}],"schema":"https://github.com/citation-style-language/schema/raw/master/csl-citation.json"} </w:instrText>
+        <w:instrText xml:space="preserve"> ADDIN ZOTERO_TEMP </w:instrText>
       </w:r>
       <w:r>
         <w:fldChar w:fldCharType="separate"/>
       </w:r>
       <w:r>
-        <w:rPr>
-          <w:rFonts w:ascii="Aptos" w:cs="Times New Roman"/>
-          <w:kern w:val="0"/>
-          <w:lang w:val="en-GB"/>
-        </w:rPr>
-        <w:t>(Jones, n.d.; Wikipedia contributors, 2023)</w:t>
-      </w:r>
-      <w:r>
         <w:fldChar w:fldCharType="end"/>
       </w:r>
       <w:r>
+        <w:t xml:space="preserve">. </w:t>
+      </w:r>
+      <w:r>
+        <w:t xml:space="preserve">When an item arrives for processing, it </w:t>
+      </w:r>
+      <w:r>
+        <w:t>looks for the</w:t>
+      </w:r>
+      <w:r>
+        <w:t xml:space="preserve"> bin the</w:t>
+      </w:r>
+      <w:r>
+        <w:t xml:space="preserve"> with least remaining space </w:t>
+      </w:r>
+      <w:r>
+        <w:t>but with enough to fit the item.</w:t>
+      </w:r>
+      <w:r>
+        <w:t xml:space="preserve"> If one ex</w:t>
+      </w:r>
+      <w:r>
+        <w:t>ists, the item is placed in the bin</w:t>
+      </w:r>
+      <w:r>
+        <w:t xml:space="preserve"> and if not, a new bin is opened at the item is placed there</w:t>
+      </w:r>
+      <w:r>
+        <w:t>. This process repeats until all items are placed.</w:t>
+      </w:r>
+      <w:r>
+        <w:t xml:space="preserve"> </w:t>
+      </w:r>
+      <w:r>
+        <w:t xml:space="preserve">The </w:t>
+      </w:r>
+      <w:r>
+        <w:t>approximation ratio of BFD is identical to FFD</w:t>
+      </w:r>
+      <w:r>
+        <w:t xml:space="preserve"> </w:t>
+      </w:r>
+      <w:r>
         <w:fldChar w:fldCharType="begin"/>
       </w:r>
       <w:r>
-        <w:instrText xml:space="preserve"> ADDIN ZOTERO_TEMP </w:instrText>
+        <w:instrText xml:space="preserve"> ADDIN ZOTERO_ITEM CSL_CITATION {"citationID":"y3DxIYpg","properties":{"formattedCitation":"(Jones, n.d.; Wikipedia contributors, 2023, 2024b)","plainCitation":"(Jones, n.d.; Wikipedia contributors, 2023, 2024b)","noteIndex":0},"citationItems":[{"id":534,"uris":["http://zotero.org/users/14909358/items/W5P8UKHQ"],"itemData":{"id":534,"type":"entry-encyclopedia","abstract":"First-fit-decreasing (FFD) is an algorithm for bin packing. Its input is a list of items of different sizes. Its output is a packing - a partition of the items into bins of fixed capacity, such that the sum of sizes of items in each bin is at most the capacity. Ideally, we would like to use as few bins as possible, but minimizing the number of bins is an NP-hard problem, so we use an approximately-optimal heuristic.","container-title":"Wikipedia","language":"en","license":"Creative Commons Attribution-ShareAlike License","note":"Page Version ID: 1210055959","source":"Wikipedia","title":"First-fit-decreasing bin packing","URL":"https://en.wikipedia.org/w/index.php?title=First-fit-decreasing_bin_packing&amp;oldid=1210055959","author":[{"literal":"Wikipedia contributors"}],"accessed":{"date-parts":[["2024",11,5]]},"issued":{"date-parts":[["2024",2,24]]}}},{"id":533,"uris":["http://zotero.org/users/14909358/items/XBM5Z7N2"],"itemData":{"id":533,"type":"entry-encyclopedia","abstract":"Best-fit is an online algorithm for bin packing. Its input is a list of items of different sizes. Its output is a packing - a partition of the items into bins of fixed capacity, such that the sum of sizes of items in each bin is at most the capacity. Ideally, we would like to use as few bins as possible, but minimizing the number of bins is an NP-hard problem. The best-fit algorithm uses the following heuristic:\n\nIt keeps a list of open bins, which is initially empty.\nWhen an item arrives, it finds the bin with the maximum load into which the item can fit, if any. The load of a bin is defined as the sum of sizes of existing items in the bin before placing the new item.\nIf such a bin is found, the new item is placed inside it.\nOtherwise, a new bin is opened and the coming item is placed inside it.","container-title":"Wikipedia","language":"en","license":"Creative Commons Attribution-ShareAlike License","note":"Page Version ID: 1190559703","source":"Wikipedia","title":"Best-fit bin packing","URL":"https://en.wikipedia.org/w/index.php?title=Best-fit_bin_packing&amp;oldid=1190559703","author":[{"literal":"Wikipedia contributors"}],"accessed":{"date-parts":[["2024",11,5]]},"issued":{"date-parts":[["2023",12,18]]}}},{"id":530,"uris":["http://zotero.org/users/14909358/items/53JTN7KV"],"itemData":{"id":530,"type":"webpage","container-title":"Eisah Jones","language":"en-US","title":"Bin-Packing Algorithms","URL":"https://www.eisahjones.com/sorting-algorithms","author":[{"family":"Jones","given":"Eisah"}],"accessed":{"date-parts":[["2024",11,2]]}}}],"schema":"https://github.com/citation-style-language/schema/raw/master/csl-citation.json"} </w:instrText>
       </w:r>
       <w:r>
         <w:fldChar w:fldCharType="separate"/>
       </w:r>
       <w:r>
+        <w:rPr>
+          <w:rFonts w:ascii="Aptos" w:hAnsi="Aptos"/>
+        </w:rPr>
+        <w:t>(Jones, n.d.; Wikipedia contributors, 2023, 2024b)</w:t>
+      </w:r>
+      <w:r>
         <w:fldChar w:fldCharType="end"/>
       </w:r>
       <w:r>
-        <w:t xml:space="preserve">. </w:t>
-      </w:r>
-      <w:r>
-        <w:t xml:space="preserve">When an item arrives for processing, it </w:t>
-      </w:r>
-      <w:r>
-        <w:t>looks for the</w:t>
-      </w:r>
-      <w:r>
-        <w:t xml:space="preserve"> bin the</w:t>
-      </w:r>
-      <w:r>
-        <w:t xml:space="preserve"> with least remaining space </w:t>
-      </w:r>
-      <w:r>
-        <w:t>but with enough to fit the item.</w:t>
-      </w:r>
-      <w:r>
-        <w:t xml:space="preserve"> If one ex</w:t>
-      </w:r>
-      <w:r>
-        <w:t>ists, the item is placed in the bin</w:t>
-      </w:r>
-      <w:r>
-        <w:t xml:space="preserve"> and if not, a new bin is opened at the item is placed there</w:t>
-      </w:r>
-      <w:r>
-        <w:t>. This process repeats until all items are placed.</w:t>
-      </w:r>
-      <w:r>
-        <w:t xml:space="preserve"> </w:t>
-      </w:r>
-      <w:r>
-        <w:t xml:space="preserve">The </w:t>
-      </w:r>
-      <w:r>
-        <w:t>approximation ratio of BFD is identical to FFD</w:t>
-      </w:r>
-      <w:r>
-        <w:t xml:space="preserve"> </w:t>
-      </w:r>
-      <w:r>
-        <w:fldChar w:fldCharType="begin"/>
-      </w:r>
-      <w:r>
-        <w:instrText xml:space="preserve"> ADDIN ZOTERO_ITEM CSL_CITATION {"citationID":"y3DxIYpg","properties":{"formattedCitation":"(Wikipedia contributors, 2024b)","plainCitation":"(Wikipedia contributors, 2024b)","noteIndex":0},"citationItems":[{"id":534,"uris":["http://zotero.org/users/14909358/items/W5P8UKHQ"],"itemData":{"id":534,"type":"entry-encyclopedia","abstract":"First-fit-decreasing (FFD) is an algorithm for bin packing. Its input is a list of items of different sizes. Its output is a packing - a partition of the items into bins of fixed capacity, such that the sum of sizes of items in each bin is at most the capacity. Ideally, we would like to use as few bins as possible, but minimizing the number of bins is an NP-hard problem, so we use an approximately-optimal heuristic.","container-title":"Wikipedia","language":"en","license":"Creative Commons Attribution-ShareAlike License","note":"Page Version ID: 1210055959","source":"Wikipedia","title":"First-fit-decreasing bin packing","URL":"https://en.wikipedia.org/w/index.php?title=First-fit-decreasing_bin_packing&amp;oldid=1210055959","author":[{"literal":"Wikipedia contributors"}],"accessed":{"date-parts":[["2024",11,5]]},"issued":{"date-parts":[["2024",2,24]]}}}],"schema":"https://github.com/citation-style-language/schema/raw/master/csl-citation.json"} </w:instrText>
-      </w:r>
-      <w:r>
-        <w:fldChar w:fldCharType="separate"/>
-      </w:r>
-      <w:r>
-        <w:rPr>
-          <w:rFonts w:ascii="Aptos" w:hAnsi="Aptos"/>
-        </w:rPr>
-        <w:t>(Wikipedia contributors, 2024b)</w:t>
-      </w:r>
-      <w:r>
-        <w:fldChar w:fldCharType="end"/>
-      </w:r>
-      <w:r>
         <w:t>.</w:t>
       </w:r>
     </w:p>
@@ -3382,7 +3360,7 @@
       <w:pPr>
         <w:pStyle w:val="Heading1"/>
       </w:pPr>
-      <w:bookmarkStart w:id="13" w:name="_Toc182126661"/>
+      <w:bookmarkStart w:id="13" w:name="_Toc182129277"/>
       <w:r>
         <w:t>Theoretical Complexity</w:t>
       </w:r>
@@ -3393,7 +3371,7 @@
       <w:pPr>
         <w:pStyle w:val="Heading2"/>
       </w:pPr>
-      <w:bookmarkStart w:id="14" w:name="_Toc182126662"/>
+      <w:bookmarkStart w:id="14" w:name="_Toc182129278"/>
       <w:r>
         <w:t>Time Complexity</w:t>
       </w:r>
@@ -3467,7 +3445,7 @@
       <w:pPr>
         <w:pStyle w:val="Heading2"/>
       </w:pPr>
-      <w:bookmarkStart w:id="15" w:name="_Toc182126663"/>
+      <w:bookmarkStart w:id="15" w:name="_Toc182129279"/>
       <w:r>
         <w:t>Space Complexity</w:t>
       </w:r>
@@ -3514,7 +3492,7 @@
       <w:pPr>
         <w:pStyle w:val="Heading1"/>
       </w:pPr>
-      <w:bookmarkStart w:id="16" w:name="_Toc182126664"/>
+      <w:bookmarkStart w:id="16" w:name="_Toc182129280"/>
       <w:r>
         <w:t xml:space="preserve">Complexity of </w:t>
       </w:r>
@@ -3552,7 +3530,7 @@
       <w:pPr>
         <w:pStyle w:val="Heading1"/>
       </w:pPr>
-      <w:bookmarkStart w:id="17" w:name="_Toc182126665"/>
+      <w:bookmarkStart w:id="17" w:name="_Toc182129281"/>
       <w:r>
         <w:t>Tests</w:t>
       </w:r>
@@ -4409,7 +4387,7 @@
       <w:pPr>
         <w:pStyle w:val="Heading1"/>
       </w:pPr>
-      <w:bookmarkStart w:id="18" w:name="_Toc182126666"/>
+      <w:bookmarkStart w:id="18" w:name="_Toc182129282"/>
       <w:r>
         <w:lastRenderedPageBreak/>
         <w:t>Insights</w:t>
@@ -4802,7 +4780,7 @@
       <w:pPr>
         <w:pStyle w:val="Heading1"/>
       </w:pPr>
-      <w:bookmarkStart w:id="19" w:name="_Toc182126667"/>
+      <w:bookmarkStart w:id="19" w:name="_Toc182129283"/>
       <w:r>
         <w:lastRenderedPageBreak/>
         <w:t>Conclusion</w:t>
@@ -4863,7 +4841,7 @@
       <w:pPr>
         <w:pStyle w:val="Heading1"/>
       </w:pPr>
-      <w:bookmarkStart w:id="20" w:name="_Toc182126668"/>
+      <w:bookmarkStart w:id="20" w:name="_Toc182129284"/>
       <w:r>
         <w:lastRenderedPageBreak/>
         <w:t>References</w:t>
@@ -5069,7 +5047,7 @@
           <w:rFonts w:ascii="Aptos"/>
           <w:lang w:val="en-GB"/>
         </w:rPr>
-        <w:t>. https://en.wikipedia.org/w/index.php?title=Bin_packing_problem&amp;oldid=1237237290</w:t>
+        <w:t>. https://en.wikipedia.org/wiki/Bin_packing_problem</w:t>
       </w:r>
     </w:p>
     <w:p>
@@ -6991,7 +6969,7 @@
   <w:style w:type="paragraph" w:default="1" w:styleId="Normal">
     <w:name w:val="Normal"/>
     <w:qFormat/>
-    <w:rsid w:val="00ED4604"/>
+    <w:rsid w:val="00D83B02"/>
   </w:style>
   <w:style w:type="paragraph" w:styleId="Heading1">
     <w:name w:val="heading 1"/>
@@ -7571,13 +7549,13 @@
     <w:unhideWhenUsed/>
     <w:rsid w:val="006154F0"/>
     <w:pPr>
-      <w:spacing w:before="240" w:after="120"/>
+      <w:spacing w:before="120" w:after="0"/>
     </w:pPr>
     <w:rPr>
       <w:b/>
       <w:bCs/>
-      <w:sz w:val="20"/>
-      <w:szCs w:val="20"/>
+      <w:i/>
+      <w:iCs/>
     </w:rPr>
   </w:style>
   <w:style w:type="paragraph" w:styleId="TOC2">
@@ -7593,10 +7571,10 @@
       <w:ind w:left="240"/>
     </w:pPr>
     <w:rPr>
-      <w:i/>
-      <w:iCs/>
-      <w:sz w:val="20"/>
-      <w:szCs w:val="20"/>
+      <w:b/>
+      <w:bCs/>
+      <w:sz w:val="22"/>
+      <w:szCs w:val="22"/>
     </w:rPr>
   </w:style>
   <w:style w:type="paragraph" w:styleId="TOC3">
@@ -8104,7 +8082,7 @@
 </file>
 
 <file path=customXml/itemProps1.xml><?xml version="1.0" encoding="utf-8"?>
-<ds:datastoreItem xmlns:ds="http://schemas.openxmlformats.org/officeDocument/2006/customXml" ds:itemID="{B5EEEA32-B5E1-1645-9187-A2C26070EB2B}">
+<ds:datastoreItem xmlns:ds="http://schemas.openxmlformats.org/officeDocument/2006/customXml" ds:itemID="{0DE4ACA2-01B2-724E-BCAF-52385F604D47}">
   <ds:schemaRefs>
     <ds:schemaRef ds:uri="http://schemas.openxmlformats.org/officeDocument/2006/bibliography"/>
   </ds:schemaRefs>

</xml_diff>